<commit_message>
Sync portfolio with current resume and positioning
</commit_message>
<xml_diff>
--- a/Claude outputs/Suraj_Kesharwani_NET_FullStack_Developer-1.docx
+++ b/Claude outputs/Suraj_Kesharwani_NET_FullStack_Developer-1.docx
@@ -41,11 +41,74 @@
       <w:r>
         <w:rPr>
           <w:rFonts w:ascii="Times New Roman" w:cs="Times New Roman" w:eastAsia="Times New Roman" w:hAnsi="Times New Roman"/>
-          <w:sz w:val="18"/>
-          <w:szCs w:val="18"/>
+          <w:sz w:val="17"/>
+          <w:szCs w:val="17"/>
         </w:rPr>
         <w:t xml:space="preserve">+91-9794930740 | +91-6386580826 | surajkesharwani9918@gmail.com | Chhitpalgarh, Pratapgarh (UP), India</w:t>
       </w:r>
+      <w:r>
+        <w:rPr>
+          <w:rFonts w:ascii="Times New Roman" w:cs="Times New Roman" w:eastAsia="Times New Roman" w:hAnsi="Times New Roman"/>
+          <w:color w:val="595959"/>
+          <w:sz w:val="17"/>
+          <w:szCs w:val="17"/>
+        </w:rPr>
+        <w:t xml:space="preserve"> | </w:t>
+      </w:r>
+      <w:hyperlink w:history="1" r:id="rIdlnw5h0lc1mp7steraf0bu">
+        <w:r>
+          <w:rPr>
+            <w:rFonts w:ascii="Times New Roman" w:cs="Times New Roman" w:eastAsia="Times New Roman" w:hAnsi="Times New Roman"/>
+            <w:color w:val="0563C1"/>
+            <w:sz w:val="17"/>
+            <w:szCs w:val="17"/>
+            <w:u w:val="single" w:color="0563C1"/>
+          </w:rPr>
+          <w:t xml:space="preserve">Portfolio</w:t>
+        </w:r>
+      </w:hyperlink>
+      <w:r>
+        <w:rPr>
+          <w:rFonts w:ascii="Times New Roman" w:cs="Times New Roman" w:eastAsia="Times New Roman" w:hAnsi="Times New Roman"/>
+          <w:color w:val="595959"/>
+          <w:sz w:val="17"/>
+          <w:szCs w:val="17"/>
+        </w:rPr>
+        <w:t xml:space="preserve"> | </w:t>
+      </w:r>
+      <w:hyperlink w:history="1" r:id="rIdhtixfbpipptxlikj4wtvp">
+        <w:r>
+          <w:rPr>
+            <w:rFonts w:ascii="Times New Roman" w:cs="Times New Roman" w:eastAsia="Times New Roman" w:hAnsi="Times New Roman"/>
+            <w:color w:val="0563C1"/>
+            <w:sz w:val="17"/>
+            <w:szCs w:val="17"/>
+            <w:u w:val="single" w:color="0563C1"/>
+          </w:rPr>
+          <w:t xml:space="preserve">LinkedIn</w:t>
+        </w:r>
+      </w:hyperlink>
+      <w:r>
+        <w:rPr>
+          <w:rFonts w:ascii="Times New Roman" w:cs="Times New Roman" w:eastAsia="Times New Roman" w:hAnsi="Times New Roman"/>
+          <w:color w:val="595959"/>
+          <w:sz w:val="17"/>
+          <w:szCs w:val="17"/>
+        </w:rPr>
+        <w:t xml:space="preserve"> | </w:t>
+      </w:r>
+      <w:hyperlink w:history="1" r:id="rId83wri7vneojko9zo2oach">
+        <w:r>
+          <w:rPr>
+            <w:rFonts w:ascii="Times New Roman" w:cs="Times New Roman" w:eastAsia="Times New Roman" w:hAnsi="Times New Roman"/>
+            <w:color w:val="0563C1"/>
+            <w:sz w:val="17"/>
+            <w:szCs w:val="17"/>
+            <w:u w:val="single" w:color="0563C1"/>
+          </w:rPr>
+          <w:t xml:space="preserve">GitHub</w:t>
+        </w:r>
+      </w:hyperlink>
     </w:p>
     <w:p>
       <w:pPr>

</xml_diff>